<commit_message>
Created connection back -> front (admin pages)
</commit_message>
<xml_diff>
--- a/Other/Dyplom.docx
+++ b/Other/Dyplom.docx
@@ -4196,38 +4196,6 @@
         <w:jc w:val="both"/>
         <w:rPr>
           <w:rFonts w:cstheme="minorHAnsi"/>
-          <w:b/>
-          <w:bCs/>
-          <w:szCs w:val="24"/>
-          <w:lang w:val="pl-PL"/>
-        </w:rPr>
-      </w:pPr>
-      <w:r>
-        <w:rPr>
-          <w:rFonts w:cstheme="minorHAnsi"/>
-          <w:b/>
-          <w:bCs/>
-          <w:szCs w:val="24"/>
-          <w:lang w:val="pl-PL"/>
-        </w:rPr>
-        <w:t xml:space="preserve">Pakiety dla sądu </w:t>
-      </w:r>
-      <w:r>
-        <w:rPr>
-          <w:rFonts w:cstheme="minorHAnsi"/>
-          <w:szCs w:val="24"/>
-          <w:lang w:val="pl-PL"/>
-        </w:rPr>
-        <w:t>– automatycznie generowane dokumenty zawierające pełen zestaw danych sprawy w przypadku przekazania jej do sądu.</w:t>
-      </w:r>
-    </w:p>
-    <w:p>
-      <w:pPr>
-        <w:spacing w:line="360" w:lineRule="auto"/>
-        <w:ind w:left="360"/>
-        <w:jc w:val="both"/>
-        <w:rPr>
-          <w:rFonts w:cstheme="minorHAnsi"/>
           <w:i/>
           <w:iCs/>
           <w:szCs w:val="24"/>
@@ -4253,6 +4221,32 @@
       <w:pPr>
         <w:spacing w:line="360" w:lineRule="auto"/>
         <w:ind w:left="360"/>
+        <w:jc w:val="both"/>
+        <w:rPr>
+          <w:rFonts w:cstheme="minorHAnsi"/>
+          <w:i/>
+          <w:iCs/>
+          <w:szCs w:val="24"/>
+          <w:lang w:val="pl-PL"/>
+        </w:rPr>
+      </w:pPr>
+    </w:p>
+    <w:p>
+      <w:pPr>
+        <w:spacing w:line="360" w:lineRule="auto"/>
+        <w:jc w:val="both"/>
+        <w:rPr>
+          <w:rFonts w:cstheme="minorHAnsi"/>
+          <w:i/>
+          <w:iCs/>
+          <w:szCs w:val="24"/>
+          <w:lang w:val="pl-PL"/>
+        </w:rPr>
+      </w:pPr>
+    </w:p>
+    <w:p>
+      <w:pPr>
+        <w:spacing w:line="360" w:lineRule="auto"/>
         <w:jc w:val="both"/>
         <w:rPr>
           <w:rFonts w:cstheme="minorHAnsi"/>
@@ -4573,6 +4567,18 @@
     </w:p>
     <w:p>
       <w:pPr>
+        <w:spacing w:line="360" w:lineRule="auto"/>
+        <w:ind w:left="360"/>
+        <w:jc w:val="both"/>
+        <w:rPr>
+          <w:rFonts w:cstheme="minorHAnsi"/>
+          <w:szCs w:val="24"/>
+          <w:lang w:val="pl-PL"/>
+        </w:rPr>
+      </w:pPr>
+    </w:p>
+    <w:p>
+      <w:pPr>
         <w:pStyle w:val="1"/>
         <w:jc w:val="both"/>
         <w:rPr>
@@ -4584,6 +4590,7 @@
         <w:rPr>
           <w:lang w:val="pl-PL"/>
         </w:rPr>
+        <w:lastRenderedPageBreak/>
         <w:t>Wymagania</w:t>
       </w:r>
       <w:r>
@@ -4639,7 +4646,6 @@
           <w:rFonts w:cstheme="minorHAnsi"/>
           <w:lang w:val="pl-PL"/>
         </w:rPr>
-        <w:lastRenderedPageBreak/>
         <w:t>Rejestracja spraw</w:t>
       </w:r>
     </w:p>
@@ -4825,80 +4831,6 @@
     <w:p>
       <w:pPr>
         <w:rPr>
-          <w:rStyle w:val="a7"/>
-          <w:rFonts w:cstheme="minorHAnsi"/>
-          <w:szCs w:val="24"/>
-          <w:lang w:val="pl-PL"/>
-        </w:rPr>
-      </w:pPr>
-      <w:r>
-        <w:rPr>
-          <w:rStyle w:val="a7"/>
-          <w:rFonts w:cstheme="minorHAnsi"/>
-          <w:szCs w:val="24"/>
-          <w:lang w:val="pl-PL"/>
-        </w:rPr>
-        <w:t>K</w:t>
-      </w:r>
-      <w:r>
-        <w:rPr>
-          <w:rStyle w:val="a7"/>
-          <w:rFonts w:cstheme="minorHAnsi"/>
-          <w:szCs w:val="24"/>
-          <w:lang w:val="pl-PL"/>
-        </w:rPr>
-        <w:t>opie zapasowe</w:t>
-      </w:r>
-    </w:p>
-    <w:p>
-      <w:pPr>
-        <w:pStyle w:val="a6"/>
-        <w:numPr>
-          <w:ilvl w:val="0"/>
-          <w:numId w:val="14"/>
-        </w:numPr>
-        <w:jc w:val="both"/>
-        <w:rPr>
-          <w:rFonts w:eastAsia="Times New Roman" w:cstheme="minorHAnsi"/>
-          <w:szCs w:val="24"/>
-          <w:lang w:val="pl-PL" w:eastAsia="ru-RU"/>
-        </w:rPr>
-      </w:pPr>
-      <w:r>
-        <w:rPr>
-          <w:rFonts w:eastAsia="Times New Roman" w:cstheme="minorHAnsi"/>
-          <w:szCs w:val="24"/>
-          <w:lang w:val="pl-PL" w:eastAsia="ru-RU"/>
-        </w:rPr>
-        <w:t>System automatycznie tworzy kopie zapasowe danych w określonych dniach i godzinach.</w:t>
-      </w:r>
-    </w:p>
-    <w:p>
-      <w:pPr>
-        <w:pStyle w:val="a6"/>
-        <w:numPr>
-          <w:ilvl w:val="0"/>
-          <w:numId w:val="14"/>
-        </w:numPr>
-        <w:jc w:val="both"/>
-        <w:rPr>
-          <w:rFonts w:cstheme="minorHAnsi"/>
-          <w:szCs w:val="24"/>
-          <w:lang w:val="pl-PL"/>
-        </w:rPr>
-      </w:pPr>
-      <w:r>
-        <w:rPr>
-          <w:rFonts w:eastAsia="Times New Roman" w:cstheme="minorHAnsi"/>
-          <w:szCs w:val="24"/>
-          <w:lang w:val="pl-PL" w:eastAsia="ru-RU"/>
-        </w:rPr>
-        <w:t>Administrator może także ręcznie zainicjować wykonanie kopii zapasowej.</w:t>
-      </w:r>
-    </w:p>
-    <w:p>
-      <w:pPr>
-        <w:rPr>
           <w:i/>
           <w:iCs/>
           <w:lang w:val="pl-PL"/>
@@ -5127,42 +5059,29 @@
       </w:pPr>
       <w:r>
         <w:rPr>
-          <w:rStyle w:val="a7"/>
-          <w:b w:val="0"/>
-          <w:bCs w:val="0"/>
-          <w:lang w:val="pl-PL"/>
-        </w:rPr>
-        <w:t>Przeterminowana</w:t>
-      </w:r>
-      <w:r>
-        <w:rPr>
-          <w:rStyle w:val="a7"/>
-          <w:b w:val="0"/>
-          <w:bCs w:val="0"/>
+          <w:rFonts w:eastAsia="Times New Roman" w:cstheme="minorHAnsi"/>
+          <w:szCs w:val="24"/>
+          <w:lang w:val="pl-PL" w:eastAsia="ru-RU"/>
+        </w:rPr>
+        <w:t>W sądzie</w:t>
+      </w:r>
+      <w:r>
+        <w:rPr>
+          <w:rFonts w:eastAsia="Times New Roman" w:cstheme="minorHAnsi"/>
           <w:i/>
           <w:iCs/>
-          <w:lang w:val="pl-PL"/>
-        </w:rPr>
-        <w:t xml:space="preserve"> (Overdue)</w:t>
-      </w:r>
-      <w:r>
-        <w:rPr>
-          <w:lang w:val="pl-PL"/>
-        </w:rPr>
-        <w:t xml:space="preserve"> – minęło 14/28/42 dni od terminu płatności, mandat nie został opłacony. </w:t>
-      </w:r>
-      <w:r>
-        <w:rPr>
-          <w:rStyle w:val="a7"/>
-          <w:lang w:val="pl-PL"/>
-        </w:rPr>
-        <w:t>Co każde 14 dni kwota mandatu wzrasta o 50%.</w:t>
-      </w:r>
-      <w:r>
-        <w:rPr>
-          <w:lang w:val="pl-PL"/>
-        </w:rPr>
-        <w:t xml:space="preserve"> Po 3-ciej przeterminowanej płatności sprawa trafia do sądu.</w:t>
+          <w:szCs w:val="24"/>
+          <w:lang w:val="pl-PL" w:eastAsia="ru-RU"/>
+        </w:rPr>
+        <w:t xml:space="preserve"> (In court)</w:t>
+      </w:r>
+      <w:r>
+        <w:rPr>
+          <w:rFonts w:eastAsia="Times New Roman" w:cstheme="minorHAnsi"/>
+          <w:szCs w:val="24"/>
+          <w:lang w:val="pl-PL" w:eastAsia="ru-RU"/>
+        </w:rPr>
+        <w:t xml:space="preserve"> – administrator przekazał sprawę do sądu, system wygenerował kompletny dokument.</w:t>
       </w:r>
     </w:p>
     <w:p>
@@ -5184,7 +5103,7 @@
           <w:szCs w:val="24"/>
           <w:lang w:val="pl-PL" w:eastAsia="ru-RU"/>
         </w:rPr>
-        <w:t>W sądzie</w:t>
+        <w:t>Zamknięta</w:t>
       </w:r>
       <w:r>
         <w:rPr>
@@ -5194,7 +5113,7 @@
           <w:szCs w:val="24"/>
           <w:lang w:val="pl-PL" w:eastAsia="ru-RU"/>
         </w:rPr>
-        <w:t xml:space="preserve"> (In court)</w:t>
+        <w:t xml:space="preserve"> (Closed)</w:t>
       </w:r>
       <w:r>
         <w:rPr>
@@ -5202,7 +5121,7 @@
           <w:szCs w:val="24"/>
           <w:lang w:val="pl-PL" w:eastAsia="ru-RU"/>
         </w:rPr>
-        <w:t xml:space="preserve"> – administrator przekazał sprawę do sądu, system wygenerował kompletny dokument.</w:t>
+        <w:t xml:space="preserve"> – mandat został opłacony, pracownik dołączył potwierdzenie.</w:t>
       </w:r>
     </w:p>
     <w:p>
@@ -5224,46 +5143,6 @@
           <w:szCs w:val="24"/>
           <w:lang w:val="pl-PL" w:eastAsia="ru-RU"/>
         </w:rPr>
-        <w:t>Zamknięta</w:t>
-      </w:r>
-      <w:r>
-        <w:rPr>
-          <w:rFonts w:eastAsia="Times New Roman" w:cstheme="minorHAnsi"/>
-          <w:i/>
-          <w:iCs/>
-          <w:szCs w:val="24"/>
-          <w:lang w:val="pl-PL" w:eastAsia="ru-RU"/>
-        </w:rPr>
-        <w:t xml:space="preserve"> (Closed)</w:t>
-      </w:r>
-      <w:r>
-        <w:rPr>
-          <w:rFonts w:eastAsia="Times New Roman" w:cstheme="minorHAnsi"/>
-          <w:szCs w:val="24"/>
-          <w:lang w:val="pl-PL" w:eastAsia="ru-RU"/>
-        </w:rPr>
-        <w:t xml:space="preserve"> – mandat został opłacony, pracownik dołączył potwierdzenie.</w:t>
-      </w:r>
-    </w:p>
-    <w:p>
-      <w:pPr>
-        <w:pStyle w:val="a6"/>
-        <w:numPr>
-          <w:ilvl w:val="0"/>
-          <w:numId w:val="42"/>
-        </w:numPr>
-        <w:rPr>
-          <w:rFonts w:eastAsia="Times New Roman" w:cstheme="minorHAnsi"/>
-          <w:szCs w:val="24"/>
-          <w:lang w:val="pl-PL" w:eastAsia="ru-RU"/>
-        </w:rPr>
-      </w:pPr>
-      <w:r>
-        <w:rPr>
-          <w:rFonts w:eastAsia="Times New Roman" w:cstheme="minorHAnsi"/>
-          <w:szCs w:val="24"/>
-          <w:lang w:val="pl-PL" w:eastAsia="ru-RU"/>
-        </w:rPr>
         <w:t>Archiwalna</w:t>
       </w:r>
       <w:r>
@@ -5432,7 +5311,6 @@
           <w:rFonts w:asciiTheme="minorHAnsi" w:hAnsiTheme="minorHAnsi" w:cstheme="minorHAnsi"/>
           <w:lang w:val="pl-PL"/>
         </w:rPr>
-        <w:lastRenderedPageBreak/>
         <w:t>Przedsądowe wezwanie do zapłaty</w:t>
       </w:r>
       <w:r>
@@ -5522,6 +5400,8 @@
         <w:jc w:val="both"/>
         <w:rPr>
           <w:rFonts w:asciiTheme="minorHAnsi" w:hAnsiTheme="minorHAnsi" w:cstheme="minorHAnsi"/>
+          <w:i/>
+          <w:iCs/>
           <w:lang w:val="pl-PL"/>
         </w:rPr>
       </w:pPr>
@@ -5530,7 +5410,7 @@
           <w:rFonts w:asciiTheme="minorHAnsi" w:hAnsiTheme="minorHAnsi" w:cstheme="minorHAnsi"/>
           <w:lang w:val="pl-PL"/>
         </w:rPr>
-        <w:t>Potwierdzenie uregulowania należności</w:t>
+        <w:t>Notatka służbowa</w:t>
       </w:r>
       <w:r>
         <w:rPr>
@@ -5546,23 +5426,7 @@
           <w:iCs/>
           <w:lang w:val="pl-PL"/>
         </w:rPr>
-        <w:t>(Payment Confirmation)</w:t>
-      </w:r>
-      <w:r>
-        <w:rPr>
-          <w:rFonts w:asciiTheme="minorHAnsi" w:hAnsiTheme="minorHAnsi" w:cstheme="minorHAnsi"/>
-          <w:i/>
-          <w:iCs/>
-          <w:lang w:val="pl-PL"/>
-        </w:rPr>
-        <w:t>.</w:t>
-      </w:r>
-      <w:r>
-        <w:rPr>
-          <w:rFonts w:asciiTheme="minorHAnsi" w:hAnsiTheme="minorHAnsi" w:cstheme="minorHAnsi"/>
-          <w:lang w:val="pl-PL"/>
-        </w:rPr>
-        <w:t xml:space="preserve"> </w:t>
+        <w:t>(Official Note).</w:t>
       </w:r>
     </w:p>
     <w:p>
@@ -5575,8 +5439,6 @@
         <w:jc w:val="both"/>
         <w:rPr>
           <w:rFonts w:asciiTheme="minorHAnsi" w:hAnsiTheme="minorHAnsi" w:cstheme="minorHAnsi"/>
-          <w:i/>
-          <w:iCs/>
           <w:lang w:val="pl-PL"/>
         </w:rPr>
       </w:pPr>
@@ -5585,14 +5447,7 @@
           <w:rFonts w:asciiTheme="minorHAnsi" w:hAnsiTheme="minorHAnsi" w:cstheme="minorHAnsi"/>
           <w:lang w:val="pl-PL"/>
         </w:rPr>
-        <w:t>Notatka służbowa</w:t>
-      </w:r>
-      <w:r>
-        <w:rPr>
-          <w:rFonts w:asciiTheme="minorHAnsi" w:hAnsiTheme="minorHAnsi" w:cstheme="minorHAnsi"/>
-          <w:lang w:val="pl-PL"/>
-        </w:rPr>
-        <w:t xml:space="preserve"> </w:t>
+        <w:t xml:space="preserve">Protokół kontaktu z klientem </w:t>
       </w:r>
       <w:r>
         <w:rPr>
@@ -5601,7 +5456,16 @@
           <w:iCs/>
           <w:lang w:val="pl-PL"/>
         </w:rPr>
-        <w:t>(Official Note).</w:t>
+        <w:t>(Client Contact Report)</w:t>
+      </w:r>
+      <w:r>
+        <w:rPr>
+          <w:rFonts w:asciiTheme="minorHAnsi" w:hAnsiTheme="minorHAnsi" w:cstheme="minorHAnsi"/>
+          <w:i/>
+          <w:iCs/>
+          <w:lang w:val="pl-PL"/>
+        </w:rPr>
+        <w:t>.</w:t>
       </w:r>
     </w:p>
     <w:p>
@@ -5622,45 +5486,7 @@
           <w:rFonts w:asciiTheme="minorHAnsi" w:hAnsiTheme="minorHAnsi" w:cstheme="minorHAnsi"/>
           <w:lang w:val="pl-PL"/>
         </w:rPr>
-        <w:t xml:space="preserve">Protokół kontaktu z klientem </w:t>
-      </w:r>
-      <w:r>
-        <w:rPr>
-          <w:rFonts w:asciiTheme="minorHAnsi" w:hAnsiTheme="minorHAnsi" w:cstheme="minorHAnsi"/>
-          <w:i/>
-          <w:iCs/>
-          <w:lang w:val="pl-PL"/>
-        </w:rPr>
-        <w:t>(Client Contact Report)</w:t>
-      </w:r>
-      <w:r>
-        <w:rPr>
-          <w:rFonts w:asciiTheme="minorHAnsi" w:hAnsiTheme="minorHAnsi" w:cstheme="minorHAnsi"/>
-          <w:i/>
-          <w:iCs/>
-          <w:lang w:val="pl-PL"/>
-        </w:rPr>
-        <w:t>.</w:t>
-      </w:r>
-    </w:p>
-    <w:p>
-      <w:pPr>
-        <w:pStyle w:val="a3"/>
-        <w:numPr>
-          <w:ilvl w:val="0"/>
-          <w:numId w:val="44"/>
-        </w:numPr>
-        <w:jc w:val="both"/>
-        <w:rPr>
-          <w:rFonts w:asciiTheme="minorHAnsi" w:hAnsiTheme="minorHAnsi" w:cstheme="minorHAnsi"/>
-          <w:lang w:val="pl-PL"/>
-        </w:rPr>
-      </w:pPr>
-      <w:r>
-        <w:rPr>
-          <w:rFonts w:asciiTheme="minorHAnsi" w:hAnsiTheme="minorHAnsi" w:cstheme="minorHAnsi"/>
-          <w:lang w:val="pl-PL"/>
-        </w:rPr>
+        <w:lastRenderedPageBreak/>
         <w:t xml:space="preserve">Etykiety na koperty </w:t>
       </w:r>
       <w:r>
@@ -6227,7 +6053,6 @@
       <w:bookmarkStart w:id="9" w:name="_Toc211512691"/>
       <w:proofErr w:type="spellStart"/>
       <w:r>
-        <w:lastRenderedPageBreak/>
         <w:t>Wymagania</w:t>
       </w:r>
       <w:proofErr w:type="spellEnd"/>
@@ -6313,6 +6138,7 @@
           <w:szCs w:val="24"/>
           <w:lang w:val="pl-PL"/>
         </w:rPr>
+        <w:lastRenderedPageBreak/>
         <w:t>Strona logowania oraz kluczowe funkcje systemu muszą ładować się w czasie nie dłuższym niż 3 sekundy.</w:t>
       </w:r>
     </w:p>
@@ -6595,27 +6421,14 @@
       <w:r>
         <w:t xml:space="preserve"> </w:t>
       </w:r>
-      <w:r>
-        <w:fldChar w:fldCharType="begin"/>
-      </w:r>
-      <w:r>
-        <w:instrText xml:space="preserve"> SEQ Rysunek \* ARABIC </w:instrText>
-      </w:r>
-      <w:r>
-        <w:fldChar w:fldCharType="separate"/>
-      </w:r>
-      <w:r>
-        <w:rPr>
-          <w:noProof/>
-        </w:rPr>
-        <w:t>2</w:t>
-      </w:r>
-      <w:r>
-        <w:rPr>
-          <w:noProof/>
-        </w:rPr>
-        <w:fldChar w:fldCharType="end"/>
-      </w:r>
+      <w:fldSimple w:instr=" SEQ Rysunek \* ARABIC ">
+        <w:r>
+          <w:rPr>
+            <w:noProof/>
+          </w:rPr>
+          <w:t>2</w:t>
+        </w:r>
+      </w:fldSimple>
       <w:r>
         <w:rPr>
           <w:lang w:val="pl-PL"/>
@@ -6695,27 +6508,14 @@
       <w:r>
         <w:t xml:space="preserve"> </w:t>
       </w:r>
-      <w:r>
-        <w:fldChar w:fldCharType="begin"/>
-      </w:r>
-      <w:r>
-        <w:instrText xml:space="preserve"> SEQ Rysunek \* ARABIC </w:instrText>
-      </w:r>
-      <w:r>
-        <w:fldChar w:fldCharType="separate"/>
-      </w:r>
-      <w:r>
-        <w:rPr>
-          <w:noProof/>
-        </w:rPr>
-        <w:t>3</w:t>
-      </w:r>
-      <w:r>
-        <w:rPr>
-          <w:noProof/>
-        </w:rPr>
-        <w:fldChar w:fldCharType="end"/>
-      </w:r>
+      <w:fldSimple w:instr=" SEQ Rysunek \* ARABIC ">
+        <w:r>
+          <w:rPr>
+            <w:noProof/>
+          </w:rPr>
+          <w:t>3</w:t>
+        </w:r>
+      </w:fldSimple>
       <w:r>
         <w:rPr>
           <w:lang w:val="pl-PL"/>
@@ -6802,27 +6602,14 @@
       <w:r>
         <w:t xml:space="preserve"> </w:t>
       </w:r>
-      <w:r>
-        <w:fldChar w:fldCharType="begin"/>
-      </w:r>
-      <w:r>
-        <w:instrText xml:space="preserve"> SEQ Rysunek \* ARABIC </w:instrText>
-      </w:r>
-      <w:r>
-        <w:fldChar w:fldCharType="separate"/>
-      </w:r>
-      <w:r>
-        <w:rPr>
-          <w:noProof/>
-        </w:rPr>
-        <w:t>4</w:t>
-      </w:r>
-      <w:r>
-        <w:rPr>
-          <w:noProof/>
-        </w:rPr>
-        <w:fldChar w:fldCharType="end"/>
-      </w:r>
+      <w:fldSimple w:instr=" SEQ Rysunek \* ARABIC ">
+        <w:r>
+          <w:rPr>
+            <w:noProof/>
+          </w:rPr>
+          <w:t>4</w:t>
+        </w:r>
+      </w:fldSimple>
       <w:r>
         <w:rPr>
           <w:lang w:val="pl-PL"/>
@@ -8825,9 +8612,25 @@
           <w:lang w:val="pl-PL"/>
         </w:rPr>
         <w:lastRenderedPageBreak/>
-        <w:t>Diagram baz danych</w:t>
+        <w:t xml:space="preserve">Diagram baz </w:t>
+      </w:r>
+      <w:commentRangeStart w:id="14"/>
+      <w:r>
+        <w:rPr>
+          <w:lang w:val="pl-PL"/>
+        </w:rPr>
+        <w:t>danych</w:t>
       </w:r>
       <w:bookmarkEnd w:id="13"/>
+      <w:commentRangeEnd w:id="14"/>
+      <w:r>
+        <w:rPr>
+          <w:rStyle w:val="af2"/>
+          <w:rFonts w:asciiTheme="minorHAnsi" w:eastAsiaTheme="minorHAnsi" w:hAnsiTheme="minorHAnsi" w:cstheme="minorBidi"/>
+          <w:color w:val="auto"/>
+        </w:rPr>
+        <w:commentReference w:id="14"/>
+      </w:r>
     </w:p>
     <w:p>
       <w:pPr>
@@ -8853,7 +8656,7 @@
                     <pic:cNvPicPr/>
                   </pic:nvPicPr>
                   <pic:blipFill>
-                    <a:blip r:embed="rId15" cstate="print">
+                    <a:blip r:embed="rId19" cstate="print">
                       <a:extLst>
                         <a:ext uri="{28A0092B-C50C-407E-A947-70E740481C1C}">
                           <a14:useLocalDpi xmlns:a14="http://schemas.microsoft.com/office/drawing/2010/main" val="0"/>
@@ -8982,7 +8785,7 @@
           <w:lang w:val="pl-PL"/>
         </w:rPr>
       </w:pPr>
-      <w:bookmarkStart w:id="14" w:name="_Toc211512695"/>
+      <w:bookmarkStart w:id="15" w:name="_Toc211512695"/>
       <w:r>
         <w:rPr>
           <w:lang w:val="pl-PL"/>
@@ -8990,7 +8793,7 @@
         <w:lastRenderedPageBreak/>
         <w:t>Architektura systemu</w:t>
       </w:r>
-      <w:bookmarkEnd w:id="14"/>
+      <w:bookmarkEnd w:id="15"/>
     </w:p>
     <w:p>
       <w:pPr>
@@ -9163,7 +8966,7 @@
                     <pic:cNvPicPr/>
                   </pic:nvPicPr>
                   <pic:blipFill>
-                    <a:blip r:embed="rId16">
+                    <a:blip r:embed="rId20">
                       <a:extLst>
                         <a:ext uri="{28A0092B-C50C-407E-A947-70E740481C1C}">
                           <a14:useLocalDpi xmlns:a14="http://schemas.microsoft.com/office/drawing/2010/main" val="0"/>
@@ -9206,27 +9009,14 @@
       <w:r>
         <w:t xml:space="preserve"> </w:t>
       </w:r>
-      <w:r>
-        <w:fldChar w:fldCharType="begin"/>
-      </w:r>
-      <w:r>
-        <w:instrText xml:space="preserve"> SEQ Rysunek \* ARABIC </w:instrText>
-      </w:r>
-      <w:r>
-        <w:fldChar w:fldCharType="separate"/>
-      </w:r>
-      <w:r>
-        <w:rPr>
-          <w:noProof/>
-        </w:rPr>
-        <w:t>1</w:t>
-      </w:r>
-      <w:r>
-        <w:rPr>
-          <w:noProof/>
-        </w:rPr>
-        <w:fldChar w:fldCharType="end"/>
-      </w:r>
+      <w:fldSimple w:instr=" SEQ Rysunek \* ARABIC ">
+        <w:r>
+          <w:rPr>
+            <w:noProof/>
+          </w:rPr>
+          <w:t>1</w:t>
+        </w:r>
+      </w:fldSimple>
       <w:r>
         <w:rPr>
           <w:lang w:val="pl-PL"/>
@@ -9265,7 +9055,7 @@
                     <pic:cNvPicPr/>
                   </pic:nvPicPr>
                   <pic:blipFill>
-                    <a:blip r:embed="rId17">
+                    <a:blip r:embed="rId21">
                       <a:extLst>
                         <a:ext uri="{28A0092B-C50C-407E-A947-70E740481C1C}">
                           <a14:useLocalDpi xmlns:a14="http://schemas.microsoft.com/office/drawing/2010/main" val="0"/>
@@ -9451,7 +9241,7 @@
           <w:lang w:val="pl-PL"/>
         </w:rPr>
       </w:pPr>
-      <w:bookmarkStart w:id="15" w:name="_Toc211512696"/>
+      <w:bookmarkStart w:id="16" w:name="_Toc211512696"/>
       <w:r>
         <w:rPr>
           <w:lang w:val="pl-PL"/>
@@ -9459,7 +9249,7 @@
         <w:lastRenderedPageBreak/>
         <w:t>Aplikacja serwerowa</w:t>
       </w:r>
-      <w:bookmarkEnd w:id="15"/>
+      <w:bookmarkEnd w:id="16"/>
     </w:p>
     <w:p>
       <w:pPr>
@@ -9470,14 +9260,14 @@
           <w:lang w:val="pl-PL"/>
         </w:rPr>
       </w:pPr>
-      <w:bookmarkStart w:id="16" w:name="_Toc211512697"/>
+      <w:bookmarkStart w:id="17" w:name="_Toc211512697"/>
       <w:r>
         <w:rPr>
           <w:lang w:val="pl-PL"/>
         </w:rPr>
         <w:t>Spring Boot (Java)</w:t>
       </w:r>
-      <w:bookmarkEnd w:id="16"/>
+      <w:bookmarkEnd w:id="17"/>
     </w:p>
     <w:p>
       <w:pPr>
@@ -9991,14 +9781,14 @@
           <w:lang w:val="pl-PL"/>
         </w:rPr>
       </w:pPr>
-      <w:bookmarkStart w:id="17" w:name="_Toc211512698"/>
+      <w:bookmarkStart w:id="18" w:name="_Toc211512698"/>
       <w:r>
         <w:rPr>
           <w:lang w:val="pl-PL"/>
         </w:rPr>
         <w:t>Architektura aplikacji</w:t>
       </w:r>
-      <w:bookmarkEnd w:id="17"/>
+      <w:bookmarkEnd w:id="18"/>
     </w:p>
     <w:p>
       <w:pPr>
@@ -10163,7 +9953,7 @@
           <w:lang w:val="pl-PL"/>
         </w:rPr>
       </w:pPr>
-      <w:commentRangeStart w:id="18"/>
+      <w:commentRangeStart w:id="19"/>
       <w:r>
         <w:rPr>
           <w:b/>
@@ -10173,12 +9963,12 @@
         </w:rPr>
         <w:t>Problemy</w:t>
       </w:r>
-      <w:commentRangeEnd w:id="18"/>
+      <w:commentRangeEnd w:id="19"/>
       <w:r>
         <w:rPr>
           <w:rStyle w:val="af2"/>
         </w:rPr>
-        <w:commentReference w:id="18"/>
+        <w:commentReference w:id="19"/>
       </w:r>
       <w:r>
         <w:rPr>
@@ -10323,7 +10113,7 @@
           <w:lang w:val="pl-PL"/>
         </w:rPr>
       </w:pPr>
-      <w:bookmarkStart w:id="19" w:name="_Toc211512699"/>
+      <w:bookmarkStart w:id="20" w:name="_Toc211512699"/>
       <w:r>
         <w:rPr>
           <w:lang w:val="pl-PL"/>
@@ -10331,7 +10121,7 @@
         <w:lastRenderedPageBreak/>
         <w:t>Aplikacja kliencka</w:t>
       </w:r>
-      <w:bookmarkEnd w:id="19"/>
+      <w:bookmarkEnd w:id="20"/>
     </w:p>
     <w:p>
       <w:pPr>
@@ -10344,7 +10134,7 @@
           <w:lang w:val="pl-PL"/>
         </w:rPr>
       </w:pPr>
-      <w:bookmarkStart w:id="20" w:name="_Toc211512700"/>
+      <w:bookmarkStart w:id="21" w:name="_Toc211512700"/>
       <w:r>
         <w:rPr>
           <w:rStyle w:val="a7"/>
@@ -10354,7 +10144,7 @@
         </w:rPr>
         <w:t>React</w:t>
       </w:r>
-      <w:bookmarkEnd w:id="20"/>
+      <w:bookmarkEnd w:id="21"/>
     </w:p>
     <w:p>
       <w:pPr>
@@ -10905,14 +10695,14 @@
           <w:lang w:val="pl-PL"/>
         </w:rPr>
       </w:pPr>
-      <w:bookmarkStart w:id="21" w:name="_Toc211512701"/>
+      <w:bookmarkStart w:id="22" w:name="_Toc211512701"/>
       <w:r>
         <w:rPr>
           <w:lang w:val="pl-PL"/>
         </w:rPr>
         <w:t>Architektura aplikacji</w:t>
       </w:r>
-      <w:bookmarkEnd w:id="21"/>
+      <w:bookmarkEnd w:id="22"/>
     </w:p>
     <w:p>
       <w:pPr>
@@ -11315,7 +11105,7 @@
           <w:lang w:val="pl-PL"/>
         </w:rPr>
       </w:pPr>
-      <w:bookmarkStart w:id="22" w:name="_Toc211512702"/>
+      <w:bookmarkStart w:id="23" w:name="_Toc211512702"/>
       <w:r>
         <w:rPr>
           <w:lang w:val="pl-PL"/>
@@ -11323,7 +11113,7 @@
         <w:lastRenderedPageBreak/>
         <w:t>Warstwa persystencji danych</w:t>
       </w:r>
-      <w:bookmarkEnd w:id="22"/>
+      <w:bookmarkEnd w:id="23"/>
     </w:p>
     <w:p>
       <w:pPr>
@@ -11334,14 +11124,14 @@
           <w:lang w:val="pl-PL"/>
         </w:rPr>
       </w:pPr>
-      <w:bookmarkStart w:id="23" w:name="_Toc211512703"/>
+      <w:bookmarkStart w:id="24" w:name="_Toc211512703"/>
       <w:r>
         <w:rPr>
           <w:lang w:val="pl-PL"/>
         </w:rPr>
         <w:t>PostgreSQL</w:t>
       </w:r>
-      <w:bookmarkEnd w:id="23"/>
+      <w:bookmarkEnd w:id="24"/>
     </w:p>
     <w:p>
       <w:pPr>
@@ -11585,7 +11375,7 @@
           <w:lang w:val="pl-PL"/>
         </w:rPr>
       </w:pPr>
-      <w:bookmarkStart w:id="24" w:name="_Toc211512704"/>
+      <w:bookmarkStart w:id="25" w:name="_Toc211512704"/>
       <w:r>
         <w:rPr>
           <w:lang w:val="pl-PL"/>
@@ -11593,7 +11383,7 @@
         <w:lastRenderedPageBreak/>
         <w:t>Wdrożenie aplikacji</w:t>
       </w:r>
-      <w:bookmarkEnd w:id="24"/>
+      <w:bookmarkEnd w:id="25"/>
       <w:r>
         <w:rPr>
           <w:lang w:val="pl-PL"/>
@@ -11610,14 +11400,14 @@
           <w:lang w:val="pl-PL"/>
         </w:rPr>
       </w:pPr>
-      <w:bookmarkStart w:id="25" w:name="_Toc211512705"/>
+      <w:bookmarkStart w:id="26" w:name="_Toc211512705"/>
       <w:r>
         <w:rPr>
           <w:lang w:val="pl-PL"/>
         </w:rPr>
         <w:t>Architektura wdrożeniowa</w:t>
       </w:r>
-      <w:bookmarkEnd w:id="25"/>
+      <w:bookmarkEnd w:id="26"/>
     </w:p>
     <w:p>
       <w:pPr>
@@ -11654,21 +11444,7 @@
           <w:szCs w:val="24"/>
           <w:lang w:val="pl-PL"/>
         </w:rPr>
-        <w:t>System przechowuje dane w centralnej bazie danych oraz w lokalnym repozytorium plików znajdującym się na serwerze.</w:t>
-      </w:r>
-      <w:r>
-        <w:rPr>
-          <w:szCs w:val="24"/>
-          <w:lang w:val="pl-PL"/>
-        </w:rPr>
-        <w:t xml:space="preserve"> </w:t>
-      </w:r>
-      <w:r>
-        <w:rPr>
-          <w:szCs w:val="24"/>
-          <w:lang w:val="pl-PL"/>
-        </w:rPr>
-        <w:t>Dzięki temu rozwiązaniu zachowana jest integralność danych, bezpieczeństwo oraz możliwość łatwego wykonywania kopii zapasowych.</w:t>
+        <w:t>System przechowuje dane w centralnej bazie danych oraz w lokalnym repozytorium plików znajdującym się na serwerze. Dzięki temu rozwiązaniu zachowana jest integralność danych, bezpieczeństwo oraz możliwość łatwego wykonywania kopii zapasowych.</w:t>
       </w:r>
     </w:p>
     <w:p>
@@ -11814,21 +11590,7 @@
           <w:lang w:val="pl-PL"/>
         </w:rPr>
         <w:br/>
-        <w:t>/storage/cases/{case_id}/</w:t>
-      </w:r>
-      <w:r>
-        <w:rPr>
-          <w:szCs w:val="24"/>
-          <w:lang w:val="pl-PL"/>
-        </w:rPr>
-        <w:t xml:space="preserve">. </w:t>
-      </w:r>
-      <w:r>
-        <w:rPr>
-          <w:szCs w:val="24"/>
-          <w:lang w:val="pl-PL"/>
-        </w:rPr>
-        <w:t>W bazie danych zapisywane są jedynie ścieżki do tych plików, co ogranicza obciążenie bazy danych i ułatwia zarządzanie zasobami.</w:t>
+        <w:t>/storage/cases/{case_id}/. W bazie danych zapisywane są jedynie ścieżki do tych plików, co ogranicza obciążenie bazy danych i ułatwia zarządzanie zasobami.</w:t>
       </w:r>
     </w:p>
     <w:p>
@@ -11973,7 +11735,7 @@
           <w:lang w:val="pl-PL"/>
         </w:rPr>
       </w:pPr>
-      <w:bookmarkStart w:id="26" w:name="_Toc211512706"/>
+      <w:bookmarkStart w:id="27" w:name="_Toc211512706"/>
       <w:r>
         <w:rPr>
           <w:lang w:val="pl-PL"/>
@@ -11981,7 +11743,7 @@
         <w:lastRenderedPageBreak/>
         <w:t>Podsumowanie</w:t>
       </w:r>
-      <w:bookmarkEnd w:id="26"/>
+      <w:bookmarkEnd w:id="27"/>
     </w:p>
     <w:p>
       <w:pPr>
@@ -12030,14 +11792,14 @@
           <w:lang w:val="pl-PL"/>
         </w:rPr>
       </w:pPr>
-      <w:bookmarkStart w:id="27" w:name="_Toc211512707"/>
+      <w:bookmarkStart w:id="28" w:name="_Toc211512707"/>
       <w:r>
         <w:rPr>
           <w:lang w:val="pl-PL"/>
         </w:rPr>
         <w:t>Dalszy rozwój</w:t>
       </w:r>
-      <w:bookmarkEnd w:id="27"/>
+      <w:bookmarkEnd w:id="28"/>
     </w:p>
     <w:p>
       <w:pPr>
@@ -12209,7 +11971,7 @@
           <w:lang w:val="en-US"/>
         </w:rPr>
       </w:pPr>
-      <w:bookmarkStart w:id="28" w:name="_Toc211512708"/>
+      <w:bookmarkStart w:id="29" w:name="_Toc211512708"/>
       <w:proofErr w:type="spellStart"/>
       <w:r>
         <w:rPr>
@@ -12218,7 +11980,7 @@
         <w:lastRenderedPageBreak/>
         <w:t>Biblografia</w:t>
       </w:r>
-      <w:bookmarkEnd w:id="28"/>
+      <w:bookmarkEnd w:id="29"/>
       <w:proofErr w:type="spellEnd"/>
     </w:p>
     <w:p>
@@ -12990,7 +12752,29 @@
 
 <file path=word/comments.xml><?xml version="1.0" encoding="utf-8"?>
 <w:comments xmlns:wpc="http://schemas.microsoft.com/office/word/2010/wordprocessingCanvas" xmlns:cx="http://schemas.microsoft.com/office/drawing/2014/chartex" xmlns:cx1="http://schemas.microsoft.com/office/drawing/2015/9/8/chartex" xmlns:cx2="http://schemas.microsoft.com/office/drawing/2015/10/21/chartex" xmlns:cx3="http://schemas.microsoft.com/office/drawing/2016/5/9/chartex" xmlns:cx4="http://schemas.microsoft.com/office/drawing/2016/5/10/chartex" xmlns:cx5="http://schemas.microsoft.com/office/drawing/2016/5/11/chartex" xmlns:cx6="http://schemas.microsoft.com/office/drawing/2016/5/12/chartex" xmlns:cx7="http://schemas.microsoft.com/office/drawing/2016/5/13/chartex" xmlns:cx8="http://schemas.microsoft.com/office/drawing/2016/5/14/chartex" xmlns:mc="http://schemas.openxmlformats.org/markup-compatibility/2006" xmlns:aink="http://schemas.microsoft.com/office/drawing/2016/ink" xmlns:am3d="http://schemas.microsoft.com/office/drawing/2017/model3d" xmlns:o="urn:schemas-microsoft-com:office:office" xmlns:r="http://schemas.openxmlformats.org/officeDocument/2006/relationships" xmlns:m="http://schemas.openxmlformats.org/officeDocument/2006/math" xmlns:v="urn:schemas-microsoft-com:vml" xmlns:wp14="http://schemas.microsoft.com/office/word/2010/wordprocessingDrawing" xmlns:wp="http://schemas.openxmlformats.org/drawingml/2006/wordprocessingDrawing" xmlns:w10="urn:schemas-microsoft-com:office:word" xmlns:w="http://schemas.openxmlformats.org/wordprocessingml/2006/main" xmlns:w14="http://schemas.microsoft.com/office/word/2010/wordml" xmlns:w15="http://schemas.microsoft.com/office/word/2012/wordml" xmlns:w16cex="http://schemas.microsoft.com/office/word/2018/wordml/cex" xmlns:w16cid="http://schemas.microsoft.com/office/word/2016/wordml/cid" xmlns:w16="http://schemas.microsoft.com/office/word/2018/wordml" xmlns:w16sdtdh="http://schemas.microsoft.com/office/word/2020/wordml/sdtdatahash" xmlns:w16se="http://schemas.microsoft.com/office/word/2015/wordml/symex" xmlns:wpg="http://schemas.microsoft.com/office/word/2010/wordprocessingGroup" xmlns:wpi="http://schemas.microsoft.com/office/word/2010/wordprocessingInk" xmlns:wne="http://schemas.microsoft.com/office/word/2006/wordml" xmlns:wps="http://schemas.microsoft.com/office/word/2010/wordprocessingShape" mc:Ignorable="w14 w15 w16se w16cid w16 w16cex w16sdtdh wp14">
-  <w:comment w:id="18" w:author="Anastasiia Fomina" w:date="2025-10-15T19:02:00Z" w:initials="AF">
+  <w:comment w:id="14" w:author="Anastasiia Fomina" w:date="2026-05-05T19:20:00Z" w:initials="AF">
+    <w:p>
+      <w:pPr>
+        <w:pStyle w:val="af3"/>
+        <w:rPr>
+          <w:lang w:val="pl-PL"/>
+        </w:rPr>
+      </w:pPr>
+      <w:r>
+        <w:rPr>
+          <w:rStyle w:val="af2"/>
+        </w:rPr>
+        <w:annotationRef/>
+      </w:r>
+      <w:r>
+        <w:rPr>
+          <w:lang w:val="pl-PL"/>
+        </w:rPr>
+        <w:t>Redo diagram (enums)</w:t>
+      </w:r>
+    </w:p>
+  </w:comment>
+  <w:comment w:id="19" w:author="Anastasiia Fomina" w:date="2025-10-15T19:02:00Z" w:initials="AF">
     <w:p>
       <w:pPr>
         <w:pStyle w:val="af3"/>
@@ -13017,18 +12801,21 @@
 
 <file path=word/commentsExtended.xml><?xml version="1.0" encoding="utf-8"?>
 <w15:commentsEx xmlns:wpc="http://schemas.microsoft.com/office/word/2010/wordprocessingCanvas" xmlns:cx="http://schemas.microsoft.com/office/drawing/2014/chartex" xmlns:cx1="http://schemas.microsoft.com/office/drawing/2015/9/8/chartex" xmlns:cx2="http://schemas.microsoft.com/office/drawing/2015/10/21/chartex" xmlns:cx3="http://schemas.microsoft.com/office/drawing/2016/5/9/chartex" xmlns:cx4="http://schemas.microsoft.com/office/drawing/2016/5/10/chartex" xmlns:cx5="http://schemas.microsoft.com/office/drawing/2016/5/11/chartex" xmlns:cx6="http://schemas.microsoft.com/office/drawing/2016/5/12/chartex" xmlns:cx7="http://schemas.microsoft.com/office/drawing/2016/5/13/chartex" xmlns:cx8="http://schemas.microsoft.com/office/drawing/2016/5/14/chartex" xmlns:mc="http://schemas.openxmlformats.org/markup-compatibility/2006" xmlns:aink="http://schemas.microsoft.com/office/drawing/2016/ink" xmlns:am3d="http://schemas.microsoft.com/office/drawing/2017/model3d" xmlns:o="urn:schemas-microsoft-com:office:office" xmlns:r="http://schemas.openxmlformats.org/officeDocument/2006/relationships" xmlns:m="http://schemas.openxmlformats.org/officeDocument/2006/math" xmlns:v="urn:schemas-microsoft-com:vml" xmlns:wp14="http://schemas.microsoft.com/office/word/2010/wordprocessingDrawing" xmlns:wp="http://schemas.openxmlformats.org/drawingml/2006/wordprocessingDrawing" xmlns:w10="urn:schemas-microsoft-com:office:word" xmlns:w="http://schemas.openxmlformats.org/wordprocessingml/2006/main" xmlns:w14="http://schemas.microsoft.com/office/word/2010/wordml" xmlns:w15="http://schemas.microsoft.com/office/word/2012/wordml" xmlns:w16cex="http://schemas.microsoft.com/office/word/2018/wordml/cex" xmlns:w16cid="http://schemas.microsoft.com/office/word/2016/wordml/cid" xmlns:w16="http://schemas.microsoft.com/office/word/2018/wordml" xmlns:w16sdtdh="http://schemas.microsoft.com/office/word/2020/wordml/sdtdatahash" xmlns:w16se="http://schemas.microsoft.com/office/word/2015/wordml/symex" xmlns:wpg="http://schemas.microsoft.com/office/word/2010/wordprocessingGroup" xmlns:wpi="http://schemas.microsoft.com/office/word/2010/wordprocessingInk" xmlns:wne="http://schemas.microsoft.com/office/word/2006/wordml" xmlns:wps="http://schemas.microsoft.com/office/word/2010/wordprocessingShape" mc:Ignorable="w14 w15 w16se w16cid w16 w16cex w16sdtdh wp14">
+  <w15:commentEx w15:paraId="0EB26A19" w15:done="1"/>
   <w15:commentEx w15:paraId="2318E72A" w15:done="1"/>
 </w15:commentsEx>
 </file>
 
 <file path=word/commentsExtensible.xml><?xml version="1.0" encoding="utf-8"?>
 <w16cex:commentsExtensible xmlns:wpc="http://schemas.microsoft.com/office/word/2010/wordprocessingCanvas" xmlns:cx="http://schemas.microsoft.com/office/drawing/2014/chartex" xmlns:cx1="http://schemas.microsoft.com/office/drawing/2015/9/8/chartex" xmlns:cx2="http://schemas.microsoft.com/office/drawing/2015/10/21/chartex" xmlns:cx3="http://schemas.microsoft.com/office/drawing/2016/5/9/chartex" xmlns:cx4="http://schemas.microsoft.com/office/drawing/2016/5/10/chartex" xmlns:cx5="http://schemas.microsoft.com/office/drawing/2016/5/11/chartex" xmlns:cx6="http://schemas.microsoft.com/office/drawing/2016/5/12/chartex" xmlns:cx7="http://schemas.microsoft.com/office/drawing/2016/5/13/chartex" xmlns:cx8="http://schemas.microsoft.com/office/drawing/2016/5/14/chartex" xmlns:mc="http://schemas.openxmlformats.org/markup-compatibility/2006" xmlns:aink="http://schemas.microsoft.com/office/drawing/2016/ink" xmlns:am3d="http://schemas.microsoft.com/office/drawing/2017/model3d" xmlns:o="urn:schemas-microsoft-com:office:office" xmlns:r="http://schemas.openxmlformats.org/officeDocument/2006/relationships" xmlns:m="http://schemas.openxmlformats.org/officeDocument/2006/math" xmlns:v="urn:schemas-microsoft-com:vml" xmlns:wp14="http://schemas.microsoft.com/office/word/2010/wordprocessingDrawing" xmlns:wp="http://schemas.openxmlformats.org/drawingml/2006/wordprocessingDrawing" xmlns:w10="urn:schemas-microsoft-com:office:word" xmlns:w="http://schemas.openxmlformats.org/wordprocessingml/2006/main" xmlns:w14="http://schemas.microsoft.com/office/word/2010/wordml" xmlns:w15="http://schemas.microsoft.com/office/word/2012/wordml" xmlns:w16cex="http://schemas.microsoft.com/office/word/2018/wordml/cex" xmlns:w16cid="http://schemas.microsoft.com/office/word/2016/wordml/cid" xmlns:w16="http://schemas.microsoft.com/office/word/2018/wordml" xmlns:w16sdtdh="http://schemas.microsoft.com/office/word/2020/wordml/sdtdatahash" xmlns:w16se="http://schemas.microsoft.com/office/word/2015/wordml/symex" xmlns:wpg="http://schemas.microsoft.com/office/word/2010/wordprocessingGroup" xmlns:wpi="http://schemas.microsoft.com/office/word/2010/wordprocessingInk" xmlns:wne="http://schemas.microsoft.com/office/word/2006/wordml" xmlns:wps="http://schemas.microsoft.com/office/word/2010/wordprocessingShape" mc:Ignorable="w14 w15 w16se w16cid w16 w16cex w16sdtdh wp14">
+  <w16cex:commentExtensible w16cex:durableId="2DA4C188" w16cex:dateUtc="2026-05-05T17:20:00Z"/>
   <w16cex:commentExtensible w16cex:durableId="2C9A6E2B" w16cex:dateUtc="2025-10-15T17:02:00Z"/>
 </w16cex:commentsExtensible>
 </file>
 
 <file path=word/commentsIds.xml><?xml version="1.0" encoding="utf-8"?>
 <w16cid:commentsIds xmlns:wpc="http://schemas.microsoft.com/office/word/2010/wordprocessingCanvas" xmlns:cx="http://schemas.microsoft.com/office/drawing/2014/chartex" xmlns:cx1="http://schemas.microsoft.com/office/drawing/2015/9/8/chartex" xmlns:cx2="http://schemas.microsoft.com/office/drawing/2015/10/21/chartex" xmlns:cx3="http://schemas.microsoft.com/office/drawing/2016/5/9/chartex" xmlns:cx4="http://schemas.microsoft.com/office/drawing/2016/5/10/chartex" xmlns:cx5="http://schemas.microsoft.com/office/drawing/2016/5/11/chartex" xmlns:cx6="http://schemas.microsoft.com/office/drawing/2016/5/12/chartex" xmlns:cx7="http://schemas.microsoft.com/office/drawing/2016/5/13/chartex" xmlns:cx8="http://schemas.microsoft.com/office/drawing/2016/5/14/chartex" xmlns:mc="http://schemas.openxmlformats.org/markup-compatibility/2006" xmlns:aink="http://schemas.microsoft.com/office/drawing/2016/ink" xmlns:am3d="http://schemas.microsoft.com/office/drawing/2017/model3d" xmlns:o="urn:schemas-microsoft-com:office:office" xmlns:r="http://schemas.openxmlformats.org/officeDocument/2006/relationships" xmlns:m="http://schemas.openxmlformats.org/officeDocument/2006/math" xmlns:v="urn:schemas-microsoft-com:vml" xmlns:wp14="http://schemas.microsoft.com/office/word/2010/wordprocessingDrawing" xmlns:wp="http://schemas.openxmlformats.org/drawingml/2006/wordprocessingDrawing" xmlns:w10="urn:schemas-microsoft-com:office:word" xmlns:w="http://schemas.openxmlformats.org/wordprocessingml/2006/main" xmlns:w14="http://schemas.microsoft.com/office/word/2010/wordml" xmlns:w15="http://schemas.microsoft.com/office/word/2012/wordml" xmlns:w16cex="http://schemas.microsoft.com/office/word/2018/wordml/cex" xmlns:w16cid="http://schemas.microsoft.com/office/word/2016/wordml/cid" xmlns:w16="http://schemas.microsoft.com/office/word/2018/wordml" xmlns:w16sdtdh="http://schemas.microsoft.com/office/word/2020/wordml/sdtdatahash" xmlns:w16se="http://schemas.microsoft.com/office/word/2015/wordml/symex" xmlns:wpg="http://schemas.microsoft.com/office/word/2010/wordprocessingGroup" xmlns:wpi="http://schemas.microsoft.com/office/word/2010/wordprocessingInk" xmlns:wne="http://schemas.microsoft.com/office/word/2006/wordml" xmlns:wps="http://schemas.microsoft.com/office/word/2010/wordprocessingShape" mc:Ignorable="w14 w15 w16se w16cid w16 w16cex w16sdtdh wp14">
+  <w16cid:commentId w16cid:paraId="0EB26A19" w16cid:durableId="2DA4C188"/>
   <w16cid:commentId w16cid:paraId="2318E72A" w16cid:durableId="2C9A6E2B"/>
 </w16cid:commentsIds>
 </file>
@@ -18483,15 +18270,19 @@
   <w:abstractNum w:abstractNumId="45" w15:restartNumberingAfterBreak="0">
     <w:nsid w:val="693866F9"/>
     <w:multiLevelType w:val="hybridMultilevel"/>
-    <w:tmpl w:val="3CB20C10"/>
-    <w:lvl w:ilvl="0" w:tplc="0419000F">
+    <w:tmpl w:val="318ACFC6"/>
+    <w:lvl w:ilvl="0" w:tplc="8BAA60FC">
       <w:start w:val="1"/>
       <w:numFmt w:val="decimal"/>
       <w:lvlText w:val="%1."/>
       <w:lvlJc w:val="left"/>
       <w:pPr>
-        <w:ind w:left="1440" w:hanging="360"/>
-      </w:pPr>
+        <w:ind w:left="1494" w:hanging="360"/>
+      </w:pPr>
+      <w:rPr>
+        <w:i w:val="0"/>
+        <w:iCs w:val="0"/>
+      </w:rPr>
     </w:lvl>
     <w:lvl w:ilvl="1" w:tplc="04190019" w:tentative="1">
       <w:start w:val="1"/>
@@ -19789,6 +19580,7 @@
   <w:style w:type="character" w:default="1" w:styleId="a0">
     <w:name w:val="Default Paragraph Font"/>
     <w:uiPriority w:val="1"/>
+    <w:semiHidden/>
     <w:unhideWhenUsed/>
   </w:style>
   <w:style w:type="table" w:default="1" w:styleId="a1">

</xml_diff>